<commit_message>
fix: widget CSP + chart icon + ads impression resilience + chart-bar icon
- CSP frame-src: agregado ko-fi.com y nowpayments.io en 3 middlewares (ciszubot, muzicmania, ciszukoantony)
- CSP connect-src: agregado stats.g.doubleclick.net para GA4 en 3 middlewares
- chart icon: renombrado chart -> chart-bar en Navbar/Footer ciszubot y stats page muzicmania
- ads impression API: resiliente a errores de DB (devuelve 200 aunque falle telemetría)
- Hero title typography: verificado (usa SmartImage para logotipo)
- Typecheck: 4 webs pasan sin errores
</commit_message>
<xml_diff>
--- a/projects/ciszu/website/public/docs/docx/ABOUT.docx
+++ b/projects/ciszu/website/public/docs/docx/ABOUT.docx
@@ -139,7 +139,7 @@
         </w:numPr>
       </w:pPr>
       <w:r>
-        <w:t xml:space="preserve">CiszuNetwork Page (apps/website)</w:t>
+        <w:t xml:space="preserve">CiszuNetwork Page (projects/ciszu/website)</w:t>
       </w:r>
       <w:r>
         <w:t xml:space="preserve"> </w:t>
@@ -168,7 +168,7 @@
         </w:numPr>
       </w:pPr>
       <w:r>
-        <w:t xml:space="preserve">Ciszuko Antony Portfolio (apps/ciszukoantony/website)</w:t>
+        <w:t xml:space="preserve">Ciszuko Antony Portfolio (projects/ciszukoantony/website)</w:t>
       </w:r>
       <w:r>
         <w:t xml:space="preserve"> </w:t>
@@ -197,7 +197,7 @@
         </w:numPr>
       </w:pPr>
       <w:r>
-        <w:t xml:space="preserve">MuzicMania (apps/muzicmania)</w:t>
+        <w:t xml:space="preserve">MuzicMania (projects/muzicmania)</w:t>
       </w:r>
       <w:r>
         <w:t xml:space="preserve"> </w:t>
@@ -280,7 +280,7 @@
         </w:numPr>
       </w:pPr>
       <w:r>
-        <w:t xml:space="preserve">CiszuBot (apps/ciszubot)</w:t>
+        <w:t xml:space="preserve">CiszuBot (projects/ciszubot)</w:t>
       </w:r>
       <w:r>
         <w:t xml:space="preserve"> </w:t>
@@ -554,7 +554,7 @@
         <w:pStyle w:val="BodyText"/>
       </w:pPr>
       <w:r>
-        <w:t xml:space="preserve">Además, cada proyecto tiene ia_docs/ con documentación técnica para agentes de IA,</w:t>
+        <w:t xml:space="preserve">Además, cada proyecto tiene documentation/ con documentación técnica para agentes de IA,</w:t>
       </w:r>
       <w:r>
         <w:t xml:space="preserve"> </w:t>
@@ -580,7 +580,7 @@
         <w:t xml:space="preserve"> </w:t>
       </w:r>
       <w:r>
-        <w:t xml:space="preserve">- ia_docs: ✅ Reestructurados siguiendo modelo estandarizado</w:t>
+        <w:t xml:space="preserve">- documentation: ✅ Reestructurados siguiendo modelo estandarizado</w:t>
       </w:r>
       <w:r>
         <w:t xml:space="preserve"> </w:t>
@@ -730,7 +730,7 @@
         </w:numPr>
       </w:pPr>
       <w:r>
-        <w:t xml:space="preserve">CiszuNetwork Page (apps/website)</w:t>
+        <w:t xml:space="preserve">CiszuNetwork Page (projects/ciszu/website)</w:t>
       </w:r>
       <w:r>
         <w:t xml:space="preserve"> </w:t>
@@ -759,7 +759,7 @@
         </w:numPr>
       </w:pPr>
       <w:r>
-        <w:t xml:space="preserve">Ciszuko Antony Portfolio (apps/ciszukoantony/website)</w:t>
+        <w:t xml:space="preserve">Ciszuko Antony Portfolio (projects/ciszukoantony/website)</w:t>
       </w:r>
       <w:r>
         <w:t xml:space="preserve"> </w:t>
@@ -788,7 +788,7 @@
         </w:numPr>
       </w:pPr>
       <w:r>
-        <w:t xml:space="preserve">MuzicMania (apps/muzicmania)</w:t>
+        <w:t xml:space="preserve">MuzicMania (projects/muzicmania)</w:t>
       </w:r>
       <w:r>
         <w:t xml:space="preserve"> </w:t>
@@ -871,7 +871,7 @@
         </w:numPr>
       </w:pPr>
       <w:r>
-        <w:t xml:space="preserve">CiszuBot (apps/ciszubot)</w:t>
+        <w:t xml:space="preserve">CiszuBot (projects/ciszubot)</w:t>
       </w:r>
       <w:r>
         <w:t xml:space="preserve"> </w:t>
@@ -1145,7 +1145,7 @@
         <w:pStyle w:val="BodyText"/>
       </w:pPr>
       <w:r>
-        <w:t xml:space="preserve">Additionally, each project has ia_docs/ with technical documentation for AI agents,</w:t>
+        <w:t xml:space="preserve">Additionally, each project has documentation/ with technical documentation for AI agents,</w:t>
       </w:r>
       <w:r>
         <w:t xml:space="preserve"> </w:t>
@@ -1171,7 +1171,7 @@
         <w:t xml:space="preserve"> </w:t>
       </w:r>
       <w:r>
-        <w:t xml:space="preserve">- ia_docs: ✅ Restructured following standardized model</w:t>
+        <w:t xml:space="preserve">- documentation: ✅ Restructured following standardized model</w:t>
       </w:r>
       <w:r>
         <w:t xml:space="preserve"> </w:t>

</xml_diff>